<commit_message>
fix: render question prompt + equation together, preserve math delimiters for MathJax
- QuestionBody renders both question_text (prompt) and latex_content (equation)
  instead of latex_content || question_text which dropped the prompt
- processMixedContent matches display/inline math in a single pass, preserving
  \$ delimiters so MathJax can typeset inline math (was stripped before)
- apply QuestionBody in TakeExam (exam + review) and AdminExamReview
- sample CSV / BulkImport template / manual: prompt lives in question_text,
  equation in latex_content (no duplication)
- ignore *.db so stray database files aren't committed
</commit_message>
<xml_diff>
--- a/USER_MANUAL.docx
+++ b/USER_MANUAL.docx
@@ -3080,7 +3080,7 @@
           <w:rFonts w:ascii="Consolas" w:hAnsi="Consolas"/>
           <w:sz w:val="19"/>
         </w:rPr>
-        <w:t>,"Chemistry Sample","Which equation correctly represents the combustion of methane?",multiple,2,"CH4 + 2O2 --&gt; CO2 + 2H2O|CH4 + O2 --&gt; CO + H2O|2CH4 + O2 --&gt; 2CO + 2H2O|CH4 + 2O2 --&gt; CO2 + 2H2",CH4 + 2O2 --&gt; CO2 + 2H2O,"CH4 + 2O2 --&gt; CO2 + 2H2O",,chemical,"Methane combustion produces carbon dioxide and water"</w:t>
+        <w:t>,"Chemistry Sample","Which equation correctly represents the combustion of methane?",multiple,2,"$CH_4 + 2O_2 \rightarrow CO_2 + 2H_2O$|$CH_4 + O_2 \rightarrow CO + H_2O$|$2CH_4 + O_2 \rightarrow 2CO + 2H_2O$|$CH_4 + 2O_2 \rightarrow CO_2 + 2H_2$","$CH_4 + 2O_2 \rightarrow CO_2 + 2H_2O$","$$CH_4 + 2O_2 \rightarrow CO_2 + 2H_2O$$",,chemical,"Methane combustion produces carbon dioxide and water"</w:t>
       </w:r>
     </w:p>
     <w:p>
@@ -3092,7 +3092,7 @@
           <w:rFonts w:ascii="Consolas" w:hAnsi="Consolas"/>
           <w:sz w:val="19"/>
         </w:rPr>
-        <w:t>,"Chemistry Sample","What is the chemical formula for water?",multiple,1,"H2O|CO2|O2|H2O2",H2O,H2O,,chemical,"Water is made of two hydrogen atoms and one oxygen atom"</w:t>
+        <w:t>,"Chemistry Sample","What is the chemical formula for water?",multiple,1,"$H_2O$|$CO_2$|$O_2$|$H_2O_2$","$H_2O$","$$H_2O$$",,chemical,"Water is made of two hydrogen atoms and one oxygen atom"</w:t>
       </w:r>
     </w:p>
     <w:p/>
@@ -3104,10 +3104,79 @@
         <w:rPr>
           <w:b/>
         </w:rPr>
+        <w:t>formulas inside answer options</w:t>
+      </w:r>
+      <w:r>
+        <w:t xml:space="preserve"> (or anywhere a math/science MCQ is rendered) you</w:t>
+      </w:r>
+    </w:p>
+    <w:p>
+      <w:r>
+        <w:t xml:space="preserve">must write the formula as LaTeX wrapped in </w:t>
+      </w:r>
+      <w:r>
+        <w:rPr>
+          <w:rFonts w:ascii="Consolas" w:hAnsi="Consolas"/>
+          <w:sz w:val="20"/>
+        </w:rPr>
+        <w:t>$...$</w:t>
+      </w:r>
+      <w:r>
+        <w:t xml:space="preserve"> — subscripts, superscripts and</w:t>
+      </w:r>
+    </w:p>
+    <w:p>
+      <w:r>
+        <w:t xml:space="preserve">arrows are not added automatically in that mode (e.g. </w:t>
+      </w:r>
+      <w:r>
+        <w:rPr>
+          <w:rFonts w:ascii="Consolas" w:hAnsi="Consolas"/>
+          <w:sz w:val="20"/>
+        </w:rPr>
+        <w:t>$H_2O$</w:t>
+      </w:r>
+      <w:r>
+        <w:t>, `$CH_4 + 2O_2</w:t>
+      </w:r>
+    </w:p>
+    <w:p>
+      <w:r>
+        <w:t>\rightarrow CO_2 + 2H_2O$`).</w:t>
+      </w:r>
+    </w:p>
+    <w:p>
+      <w:r>
+        <w:t xml:space="preserve">For </w:t>
+      </w:r>
+      <w:r>
+        <w:rPr>
+          <w:b/>
+        </w:rPr>
+        <w:t>chemistry questions</w:t>
+      </w:r>
+      <w:r>
+        <w:t xml:space="preserve"> (the </w:t>
+      </w:r>
+      <w:r>
+        <w:rPr>
+          <w:rFonts w:ascii="Consolas" w:hAnsi="Consolas"/>
+          <w:sz w:val="20"/>
+        </w:rPr>
         <w:t>chemistry</w:t>
       </w:r>
       <w:r>
-        <w:t xml:space="preserve"> questions, formula subscripts (e.g. the </w:t>
+        <w:t xml:space="preserve"> question type, where the student</w:t>
+      </w:r>
+    </w:p>
+    <w:p>
+      <w:r>
+        <w:t>types an answer) enter plain notation and the system formats it for you —</w:t>
+      </w:r>
+    </w:p>
+    <w:p>
+      <w:r>
+        <w:t xml:space="preserve">subscripts (e.g. the </w:t>
       </w:r>
       <w:r>
         <w:rPr>
@@ -3127,17 +3196,52 @@
         <w:t>H2O</w:t>
       </w:r>
       <w:r>
-        <w:t xml:space="preserve"> → H₂O)</w:t>
+        <w:t xml:space="preserve"> → H₂O) and arrow symbols are added</w:t>
       </w:r>
     </w:p>
     <w:p>
       <w:r>
-        <w:t>and the arrow symbols are added automatically, so enter formulas in plain</w:t>
-      </w:r>
-    </w:p>
-    <w:p>
-      <w:r>
-        <w:t>notation as shown above.</w:t>
+        <w:t xml:space="preserve">automatically (use </w:t>
+      </w:r>
+      <w:r>
+        <w:rPr>
+          <w:rFonts w:ascii="Consolas" w:hAnsi="Consolas"/>
+          <w:sz w:val="20"/>
+        </w:rPr>
+        <w:t>--&gt;</w:t>
+      </w:r>
+      <w:r>
+        <w:t xml:space="preserve"> for </w:t>
+      </w:r>
+      <w:r>
+        <w:rPr>
+          <w:rFonts w:ascii="Consolas" w:hAnsi="Consolas"/>
+          <w:sz w:val="20"/>
+        </w:rPr>
+        <w:t>→</w:t>
+      </w:r>
+      <w:r>
+        <w:t xml:space="preserve"> and </w:t>
+      </w:r>
+      <w:r>
+        <w:rPr>
+          <w:rFonts w:ascii="Consolas" w:hAnsi="Consolas"/>
+          <w:sz w:val="20"/>
+        </w:rPr>
+        <w:t>&lt;--&gt;</w:t>
+      </w:r>
+      <w:r>
+        <w:t xml:space="preserve"> for </w:t>
+      </w:r>
+      <w:r>
+        <w:rPr>
+          <w:rFonts w:ascii="Consolas" w:hAnsi="Consolas"/>
+          <w:sz w:val="20"/>
+        </w:rPr>
+        <w:t>⇌</w:t>
+      </w:r>
+      <w:r>
+        <w:t>).</w:t>
       </w:r>
     </w:p>
     <w:p>
@@ -3318,10 +3422,20 @@
         <w:rPr>
           <w:b/>
         </w:rPr>
+        <w:t>chemistry questions</w:t>
+      </w:r>
+      <w:r>
+        <w:t xml:space="preserve"> (the </w:t>
+      </w:r>
+      <w:r>
+        <w:rPr>
+          <w:rFonts w:ascii="Consolas" w:hAnsi="Consolas"/>
+          <w:sz w:val="20"/>
+        </w:rPr>
         <w:t>chemistry</w:t>
       </w:r>
       <w:r>
-        <w:t xml:space="preserve"> questions use the plain arrow </w:t>
+        <w:t xml:space="preserve"> type) use the plain arrow </w:t>
       </w:r>
       <w:r>
         <w:rPr>
@@ -3330,8 +3444,10 @@
         </w:rPr>
         <w:t>--&gt;</w:t>
       </w:r>
-      <w:r>
-        <w:t xml:space="preserve"> for </w:t>
+    </w:p>
+    <w:p>
+      <w:r>
+        <w:t xml:space="preserve">for </w:t>
       </w:r>
       <w:r>
         <w:rPr>
@@ -3351,10 +3467,8 @@
         <w:t>&lt;--&gt;</w:t>
       </w:r>
       <w:r>
-        <w:t xml:space="preserve"> for</w:t>
-      </w:r>
-    </w:p>
-    <w:p>
+        <w:t xml:space="preserve"> for </w:t>
+      </w:r>
       <w:r>
         <w:rPr>
           <w:rFonts w:ascii="Consolas" w:hAnsi="Consolas"/>
@@ -3363,7 +3477,12 @@
         <w:t>⇌</w:t>
       </w:r>
       <w:r>
-        <w:t xml:space="preserve"> — these are converted to proper arrow symbols when the question is shown.</w:t>
+        <w:t xml:space="preserve"> — these are converted to proper arrow symbols when</w:t>
+      </w:r>
+    </w:p>
+    <w:p>
+      <w:r>
+        <w:t>the question is shown.</w:t>
       </w:r>
     </w:p>
     <w:p>

</xml_diff>